<commit_message>
Regenerate the Word guide with the ChatGPT Plus requirement
Co-Authored-By: Claude Sonnet 5.5 <noreply@anthropic.com>
</commit_message>
<xml_diff>
--- a/docs/HUONG-DAN-KHACH-HANG.docx
+++ b/docs/HUONG-DAN-KHACH-HANG.docx
@@ -118,13 +118,13 @@
           <w:bCs/>
           <w:rFonts w:ascii="Calibri" w:cs="Calibri" w:eastAsia="Calibri" w:hAnsi="Calibri"/>
         </w:rPr>
-        <w:t xml:space="preserve">ChatGPT</w:t>
-      </w:r>
-      <w:r>
-        <w:rPr>
-          <w:rFonts w:ascii="Calibri" w:cs="Calibri" w:eastAsia="Calibri" w:hAnsi="Calibri"/>
-        </w:rPr>
-        <w:t xml:space="preserve"> (để AI hoạt động).</w:t>
+        <w:t xml:space="preserve">ChatGPT gói Plus (khoảng 20 USD/tháng)</w:t>
+      </w:r>
+      <w:r>
+        <w:rPr>
+          <w:rFonts w:ascii="Calibri" w:cs="Calibri" w:eastAsia="Calibri" w:hAnsi="Calibri"/>
+        </w:rPr>
+        <w:t xml:space="preserve"> để AI hoạt động. Chi phí này do bạn tự đăng ký và thanh toán với OpenAI, AccountingX không thu thêm.</w:t>
       </w:r>
     </w:p>
     <w:p>
@@ -364,7 +364,7 @@
         <w:rPr>
           <w:rFonts w:ascii="Calibri" w:cs="Calibri" w:eastAsia="Calibri" w:hAnsi="Calibri"/>
         </w:rPr>
-        <w:t xml:space="preserve">, đăng nhập tài khoản ChatGPT. Màn này cũng cho biết còn bao nhiêu lượt sử dụng.</w:t>
+        <w:t xml:space="preserve">, đăng nhập tài khoản ChatGPT Plus của bạn. Màn này cũng cho biết gói đang dùng và còn bao nhiêu lượt sử dụng (theo cửa sổ 5 giờ và theo tuần).</w:t>
       </w:r>
     </w:p>
     <w:p>

</xml_diff>

<commit_message>
Add the Gmail email skill with an approval ticket, and the Gmail section of the guide
Co-Authored-By: Claude Sonnet 5.5 <noreply@anthropic.com>
</commit_message>
<xml_diff>
--- a/docs/HUONG-DAN-KHACH-HANG.docx
+++ b/docs/HUONG-DAN-KHACH-HANG.docx
@@ -730,66 +730,127 @@
         <w:rPr>
           <w:rFonts w:ascii="Calibri" w:cs="Calibri" w:eastAsia="Calibri" w:hAnsi="Calibri"/>
         </w:rPr>
-        <w:t xml:space="preserve">6. Dùng hằng ngày</w:t>
-      </w:r>
-    </w:p>
-    <w:p>
-      <w:pPr>
-        <w:spacing w:after="120"/>
-      </w:pPr>
-      <w:r>
-        <w:rPr>
-          <w:rFonts w:ascii="Calibri" w:cs="Calibri" w:eastAsia="Calibri" w:hAnsi="Calibri"/>
-        </w:rPr>
-        <w:t xml:space="preserve">Nhắn cho bot trên Zalo như nhắn đồng nghiệp:</w:t>
-      </w:r>
-    </w:p>
-    <w:p>
-      <w:pPr>
-        <w:pStyle w:val="ListParagraph"/>
-        <w:numPr>
-          <w:ilvl w:val="0"/>
-          <w:numId w:val="2"/>
-        </w:numPr>
-        <w:spacing w:after="60"/>
-      </w:pPr>
-      <w:r>
-        <w:rPr>
-          <w:rFonts w:ascii="Calibri" w:cs="Calibri" w:eastAsia="Calibri" w:hAnsi="Calibri"/>
-        </w:rPr>
-        <w:t xml:space="preserve">"Xem tồn kho công ty Trí Nhân" → AI lấy báo cáo từ MISA, lưu bảng chi tiết và ghi chú bằng chứng, rồi nhắn bạn tóm tắt.</w:t>
-      </w:r>
-    </w:p>
-    <w:p>
-      <w:pPr>
-        <w:pStyle w:val="ListParagraph"/>
-        <w:numPr>
-          <w:ilvl w:val="0"/>
-          <w:numId w:val="2"/>
-        </w:numPr>
-        <w:spacing w:after="60"/>
-      </w:pPr>
-      <w:r>
-        <w:rPr>
-          <w:rFonts w:ascii="Calibri" w:cs="Calibri" w:eastAsia="Calibri" w:hAnsi="Calibri"/>
-        </w:rPr>
-        <w:t xml:space="preserve">"Gửi tóm tắt cho anh Vũ" → AI nhắn Zalo cho người đã đăng ký, không cần hỏi lại.</w:t>
-      </w:r>
-    </w:p>
-    <w:p>
-      <w:pPr>
-        <w:pStyle w:val="ListParagraph"/>
-        <w:numPr>
-          <w:ilvl w:val="0"/>
-          <w:numId w:val="2"/>
-        </w:numPr>
-        <w:spacing w:after="60"/>
-      </w:pPr>
-      <w:r>
-        <w:rPr>
-          <w:rFonts w:ascii="Calibri" w:cs="Calibri" w:eastAsia="Calibri" w:hAnsi="Calibri"/>
-        </w:rPr>
-        <w:t xml:space="preserve">Khi AI cần quyền, nó hỏi trên Zalo: trả lời </w:t>
+        <w:t xml:space="preserve">6. Gửi email qua Gmail</w:t>
+      </w:r>
+    </w:p>
+    <w:p>
+      <w:pPr>
+        <w:pStyle w:val="ListParagraph"/>
+        <w:numPr>
+          <w:ilvl w:val="0"/>
+          <w:numId w:val="7"/>
+        </w:numPr>
+        <w:spacing w:after="60"/>
+      </w:pPr>
+      <w:r>
+        <w:rPr>
+          <w:rFonts w:ascii="Calibri" w:cs="Calibri" w:eastAsia="Calibri" w:hAnsi="Calibri"/>
+        </w:rPr>
+        <w:t xml:space="preserve">Trong app mở mục </w:t>
+      </w:r>
+      <w:r>
+        <w:rPr>
+          <w:b/>
+          <w:bCs/>
+          <w:rFonts w:ascii="Calibri" w:cs="Calibri" w:eastAsia="Calibri" w:hAnsi="Calibri"/>
+        </w:rPr>
+        <w:t xml:space="preserve">Plugin</w:t>
+      </w:r>
+      <w:r>
+        <w:rPr>
+          <w:rFonts w:ascii="Calibri" w:cs="Calibri" w:eastAsia="Calibri" w:hAnsi="Calibri"/>
+        </w:rPr>
+        <w:t xml:space="preserve">, tìm </w:t>
+      </w:r>
+      <w:r>
+        <w:rPr>
+          <w:b/>
+          <w:bCs/>
+          <w:rFonts w:ascii="Calibri" w:cs="Calibri" w:eastAsia="Calibri" w:hAnsi="Calibri"/>
+        </w:rPr>
+        <w:t xml:space="preserve">Gmail</w:t>
+      </w:r>
+      <w:r>
+        <w:rPr>
+          <w:rFonts w:ascii="Calibri" w:cs="Calibri" w:eastAsia="Calibri" w:hAnsi="Calibri"/>
+        </w:rPr>
+        <w:t xml:space="preserve"> và bấm </w:t>
+      </w:r>
+      <w:r>
+        <w:rPr>
+          <w:b/>
+          <w:bCs/>
+          <w:rFonts w:ascii="Calibri" w:cs="Calibri" w:eastAsia="Calibri" w:hAnsi="Calibri"/>
+        </w:rPr>
+        <w:t xml:space="preserve">Install</w:t>
+      </w:r>
+      <w:r>
+        <w:rPr>
+          <w:rFonts w:ascii="Calibri" w:cs="Calibri" w:eastAsia="Calibri" w:hAnsi="Calibri"/>
+        </w:rPr>
+        <w:t xml:space="preserve">.</w:t>
+      </w:r>
+    </w:p>
+    <w:p>
+      <w:pPr>
+        <w:pStyle w:val="ListParagraph"/>
+        <w:numPr>
+          <w:ilvl w:val="0"/>
+          <w:numId w:val="7"/>
+        </w:numPr>
+        <w:spacing w:after="60"/>
+      </w:pPr>
+      <w:r>
+        <w:rPr>
+          <w:rFonts w:ascii="Calibri" w:cs="Calibri" w:eastAsia="Calibri" w:hAnsi="Calibri"/>
+        </w:rPr>
+        <w:t xml:space="preserve">Đăng nhập tài khoản Google của bạn và đồng ý cho phép. Plugin này do dịch vụ bên ngoài cung cấp và đọc được hộp thư, nên chỉ kết nối Gmail bạn sẵn sàng cho AI truy cập.</w:t>
+      </w:r>
+    </w:p>
+    <w:p>
+      <w:pPr>
+        <w:pStyle w:val="ListParagraph"/>
+        <w:numPr>
+          <w:ilvl w:val="0"/>
+          <w:numId w:val="7"/>
+        </w:numPr>
+        <w:spacing w:after="60"/>
+      </w:pPr>
+      <w:r>
+        <w:rPr>
+          <w:rFonts w:ascii="Calibri" w:cs="Calibri" w:eastAsia="Calibri" w:hAnsi="Calibri"/>
+        </w:rPr>
+        <w:t xml:space="preserve">Nhờ AI gửi email như nhờ một đồng nghiệp, ví dụ: "gửi báo cáo tồn kho cho a@abc.vn".</w:t>
+      </w:r>
+    </w:p>
+    <w:p>
+      <w:pPr>
+        <w:pStyle w:val="ListParagraph"/>
+        <w:numPr>
+          <w:ilvl w:val="0"/>
+          <w:numId w:val="7"/>
+        </w:numPr>
+        <w:spacing w:after="60"/>
+      </w:pPr>
+      <w:r>
+        <w:rPr>
+          <w:rFonts w:ascii="Calibri" w:cs="Calibri" w:eastAsia="Calibri" w:hAnsi="Calibri"/>
+        </w:rPr>
+        <w:t xml:space="preserve">AI </w:t>
+      </w:r>
+      <w:r>
+        <w:rPr>
+          <w:b/>
+          <w:bCs/>
+          <w:rFonts w:ascii="Calibri" w:cs="Calibri" w:eastAsia="Calibri" w:hAnsi="Calibri"/>
+        </w:rPr>
+        <w:t xml:space="preserve">soạn trước và chưa gửi</w:t>
+      </w:r>
+      <w:r>
+        <w:rPr>
+          <w:rFonts w:ascii="Calibri" w:cs="Calibri" w:eastAsia="Calibri" w:hAnsi="Calibri"/>
+        </w:rPr>
+        <w:t xml:space="preserve">. Người duyệt nhận tin trên Zalo với đủ người nhận, tiêu đề, nội dung và tệp đính kèm, rồi trả lời </w:t>
       </w:r>
       <w:r>
         <w:rPr>
@@ -802,26 +863,139 @@
         <w:rPr>
           <w:rFonts w:ascii="Calibri" w:cs="Calibri" w:eastAsia="Calibri" w:hAnsi="Calibri"/>
         </w:rPr>
-        <w:t xml:space="preserve">, </w:t>
+        <w:t xml:space="preserve"> hoặc </w:t>
       </w:r>
       <w:r>
         <w:rPr>
           <w:rFonts w:ascii="Consolas" w:cs="Consolas" w:eastAsia="Consolas" w:hAnsi="Consolas"/>
           <w:shd w:fill="F0F0F0" w:val="clear"/>
         </w:rPr>
-        <w:t xml:space="preserve">ok luôn</w:t>
-      </w:r>
-      <w:r>
-        <w:rPr>
-          <w:rFonts w:ascii="Calibri" w:cs="Calibri" w:eastAsia="Calibri" w:hAnsi="Calibri"/>
-        </w:rPr>
-        <w:t xml:space="preserve"> hoặc </w:t>
+        <w:t xml:space="preserve">không</w:t>
+      </w:r>
+      <w:r>
+        <w:rPr>
+          <w:rFonts w:ascii="Calibri" w:cs="Calibri" w:eastAsia="Calibri" w:hAnsi="Calibri"/>
+        </w:rPr>
+        <w:t xml:space="preserve">.</w:t>
+      </w:r>
+    </w:p>
+    <w:p>
+      <w:pPr>
+        <w:pStyle w:val="ListParagraph"/>
+        <w:numPr>
+          <w:ilvl w:val="0"/>
+          <w:numId w:val="7"/>
+        </w:numPr>
+        <w:spacing w:after="60"/>
+      </w:pPr>
+      <w:r>
+        <w:rPr>
+          <w:rFonts w:ascii="Calibri" w:cs="Calibri" w:eastAsia="Calibri" w:hAnsi="Calibri"/>
+        </w:rPr>
+        <w:t xml:space="preserve">Được duyệt thì AI mới gửi đúng email đó, một lần, và báo lại cho bạn. Email chỉ đính kèm tệp nằm trong thư mục công ty.</w:t>
+      </w:r>
+    </w:p>
+    <w:p>
+      <w:pPr>
+        <w:pStyle w:val="Heading2"/>
+        <w:spacing w:before="280" w:after="120"/>
+      </w:pPr>
+      <w:r>
+        <w:rPr>
+          <w:rFonts w:ascii="Calibri" w:cs="Calibri" w:eastAsia="Calibri" w:hAnsi="Calibri"/>
+        </w:rPr>
+        <w:t xml:space="preserve">7. Dùng hằng ngày</w:t>
+      </w:r>
+    </w:p>
+    <w:p>
+      <w:pPr>
+        <w:spacing w:after="120"/>
+      </w:pPr>
+      <w:r>
+        <w:rPr>
+          <w:rFonts w:ascii="Calibri" w:cs="Calibri" w:eastAsia="Calibri" w:hAnsi="Calibri"/>
+        </w:rPr>
+        <w:t xml:space="preserve">Nhắn cho bot trên Zalo như nhắn đồng nghiệp:</w:t>
+      </w:r>
+    </w:p>
+    <w:p>
+      <w:pPr>
+        <w:pStyle w:val="ListParagraph"/>
+        <w:numPr>
+          <w:ilvl w:val="0"/>
+          <w:numId w:val="2"/>
+        </w:numPr>
+        <w:spacing w:after="60"/>
+      </w:pPr>
+      <w:r>
+        <w:rPr>
+          <w:rFonts w:ascii="Calibri" w:cs="Calibri" w:eastAsia="Calibri" w:hAnsi="Calibri"/>
+        </w:rPr>
+        <w:t xml:space="preserve">"Xem tồn kho công ty Trí Nhân" → AI lấy báo cáo từ MISA, lưu bảng chi tiết và ghi chú bằng chứng, rồi nhắn bạn tóm tắt.</w:t>
+      </w:r>
+    </w:p>
+    <w:p>
+      <w:pPr>
+        <w:pStyle w:val="ListParagraph"/>
+        <w:numPr>
+          <w:ilvl w:val="0"/>
+          <w:numId w:val="2"/>
+        </w:numPr>
+        <w:spacing w:after="60"/>
+      </w:pPr>
+      <w:r>
+        <w:rPr>
+          <w:rFonts w:ascii="Calibri" w:cs="Calibri" w:eastAsia="Calibri" w:hAnsi="Calibri"/>
+        </w:rPr>
+        <w:t xml:space="preserve">"Gửi tóm tắt cho anh Vũ" → AI nhắn Zalo cho người đã đăng ký, không cần hỏi lại.</w:t>
+      </w:r>
+    </w:p>
+    <w:p>
+      <w:pPr>
+        <w:pStyle w:val="ListParagraph"/>
+        <w:numPr>
+          <w:ilvl w:val="0"/>
+          <w:numId w:val="2"/>
+        </w:numPr>
+        <w:spacing w:after="60"/>
+      </w:pPr>
+      <w:r>
+        <w:rPr>
+          <w:rFonts w:ascii="Calibri" w:cs="Calibri" w:eastAsia="Calibri" w:hAnsi="Calibri"/>
+        </w:rPr>
+        <w:t xml:space="preserve">Khi AI cần quyền, nó hỏi trên Zalo: trả lời </w:t>
       </w:r>
       <w:r>
         <w:rPr>
           <w:rFonts w:ascii="Consolas" w:cs="Consolas" w:eastAsia="Consolas" w:hAnsi="Consolas"/>
           <w:shd w:fill="F0F0F0" w:val="clear"/>
         </w:rPr>
+        <w:t xml:space="preserve">ok</w:t>
+      </w:r>
+      <w:r>
+        <w:rPr>
+          <w:rFonts w:ascii="Calibri" w:cs="Calibri" w:eastAsia="Calibri" w:hAnsi="Calibri"/>
+        </w:rPr>
+        <w:t xml:space="preserve">, </w:t>
+      </w:r>
+      <w:r>
+        <w:rPr>
+          <w:rFonts w:ascii="Consolas" w:cs="Consolas" w:eastAsia="Consolas" w:hAnsi="Consolas"/>
+          <w:shd w:fill="F0F0F0" w:val="clear"/>
+        </w:rPr>
+        <w:t xml:space="preserve">ok luôn</w:t>
+      </w:r>
+      <w:r>
+        <w:rPr>
+          <w:rFonts w:ascii="Calibri" w:cs="Calibri" w:eastAsia="Calibri" w:hAnsi="Calibri"/>
+        </w:rPr>
+        <w:t xml:space="preserve"> hoặc </w:t>
+      </w:r>
+      <w:r>
+        <w:rPr>
+          <w:rFonts w:ascii="Consolas" w:cs="Consolas" w:eastAsia="Consolas" w:hAnsi="Consolas"/>
+          <w:shd w:fill="F0F0F0" w:val="clear"/>
+        </w:rPr>
         <w:t xml:space="preserve">không</w:t>
       </w:r>
       <w:r>
@@ -851,7 +1025,7 @@
         <w:rPr>
           <w:rFonts w:ascii="Calibri" w:cs="Calibri" w:eastAsia="Calibri" w:hAnsi="Calibri"/>
         </w:rPr>
-        <w:t xml:space="preserve">7. Cái gì cần duyệt?</w:t>
+        <w:t xml:space="preserve">8. Cái gì cần duyệt?</w:t>
       </w:r>
     </w:p>
     <w:tbl>
@@ -1030,7 +1204,7 @@
               <w:rPr>
                 <w:rFonts w:ascii="Calibri" w:cs="Calibri" w:eastAsia="Calibri" w:hAnsi="Calibri"/>
               </w:rPr>
-              <w:t xml:space="preserve">AI </w:t>
+              <w:t xml:space="preserve">Tạo </w:t>
             </w:r>
             <w:r>
               <w:rPr>
@@ -1038,13 +1212,13 @@
                 <w:bCs/>
                 <w:rFonts w:ascii="Calibri" w:cs="Calibri" w:eastAsia="Calibri" w:hAnsi="Calibri"/>
               </w:rPr>
-              <w:t xml:space="preserve">hỏi người duyệt trước</w:t>
+              <w:t xml:space="preserve">phiếu duyệt</w:t>
             </w:r>
             <w:r>
               <w:rPr>
                 <w:rFonts w:ascii="Calibri" w:cs="Calibri" w:eastAsia="Calibri" w:hAnsi="Calibri"/>
               </w:rPr>
-              <w:t xml:space="preserve"> theo quy tắc của công ty. Đây là quy tắc, chưa phải khóa cứng như phiếu duyệt</w:t>
+              <w:t xml:space="preserve"> đủ nội dung; chỉ gửi sau khi được duyệt. Đây là quy trình bắt buộc với AI, nhưng chưa phải khóa cứng vì plugin Gmail do bên ngoài cung cấp</w:t>
             </w:r>
           </w:p>
         </w:tc>
@@ -1165,7 +1339,7 @@
         <w:rPr>
           <w:rFonts w:ascii="Calibri" w:cs="Calibri" w:eastAsia="Calibri" w:hAnsi="Calibri"/>
         </w:rPr>
-        <w:t xml:space="preserve">Việc ghi vào MISA đi qua </w:t>
+        <w:t xml:space="preserve">Việc ghi vào MISA và gửi email đi qua </w:t>
       </w:r>
       <w:r>
         <w:rPr>
@@ -1207,7 +1381,33 @@
         <w:rPr>
           <w:rFonts w:ascii="Calibri" w:cs="Calibri" w:eastAsia="Calibri" w:hAnsi="Calibri"/>
         </w:rPr>
-        <w:t xml:space="preserve">).</w:t>
+        <w:t xml:space="preserve">). Xem phiếu đang chờ ở </w:t>
+      </w:r>
+      <w:r>
+        <w:rPr>
+          <w:b/>
+          <w:bCs/>
+          <w:rFonts w:ascii="Calibri" w:cs="Calibri" w:eastAsia="Calibri" w:hAnsi="Calibri"/>
+        </w:rPr>
+        <w:t xml:space="preserve">Cài đặt → Chờ duyệt</w:t>
+      </w:r>
+      <w:r>
+        <w:rPr>
+          <w:rFonts w:ascii="Calibri" w:cs="Calibri" w:eastAsia="Calibri" w:hAnsi="Calibri"/>
+        </w:rPr>
+        <w:t xml:space="preserve">.</w:t>
+      </w:r>
+    </w:p>
+    <w:p>
+      <w:pPr>
+        <w:pStyle w:val="Heading2"/>
+        <w:spacing w:before="280" w:after="120"/>
+      </w:pPr>
+      <w:r>
+        <w:rPr>
+          <w:rFonts w:ascii="Calibri" w:cs="Calibri" w:eastAsia="Calibri" w:hAnsi="Calibri"/>
+        </w:rPr>
+        <w:t xml:space="preserve">9. Quyền của AI</w:t>
       </w:r>
     </w:p>
     <w:p>
@@ -1220,13 +1420,13 @@
           <w:bCs/>
           <w:rFonts w:ascii="Calibri" w:cs="Calibri" w:eastAsia="Calibri" w:hAnsi="Calibri"/>
         </w:rPr>
-        <w:t xml:space="preserve">Gmail:</w:t>
-      </w:r>
-      <w:r>
-        <w:rPr>
-          <w:rFonts w:ascii="Calibri" w:cs="Calibri" w:eastAsia="Calibri" w:hAnsi="Calibri"/>
-        </w:rPr>
-        <w:t xml:space="preserve"> cài plugin </w:t>
+        <w:t xml:space="preserve">Cài đặt → Quyền của AI</w:t>
+      </w:r>
+      <w:r>
+        <w:rPr>
+          <w:rFonts w:ascii="Calibri" w:cs="Calibri" w:eastAsia="Calibri" w:hAnsi="Calibri"/>
+        </w:rPr>
+        <w:t xml:space="preserve"> có công tắc </w:t>
       </w:r>
       <w:r>
         <w:rPr>
@@ -1234,27 +1434,27 @@
           <w:iCs/>
           <w:rFonts w:ascii="Calibri" w:cs="Calibri" w:eastAsia="Calibri" w:hAnsi="Calibri"/>
         </w:rPr>
-        <w:t xml:space="preserve">Gmail</w:t>
-      </w:r>
-      <w:r>
-        <w:rPr>
-          <w:rFonts w:ascii="Calibri" w:cs="Calibri" w:eastAsia="Calibri" w:hAnsi="Calibri"/>
-        </w:rPr>
-        <w:t xml:space="preserve"> trong mục Plugin của app và đăng nhập Google. Plugin này đọc được hộp thư và do dịch vụ bên ngoài cung cấp. Chỉ kết nối hộp thư bạn sẵn sàng cho AI truy cập. Xem phiếu đang chờ ở </w:t>
-      </w:r>
-      <w:r>
-        <w:rPr>
-          <w:b/>
-          <w:bCs/>
-          <w:rFonts w:ascii="Calibri" w:cs="Calibri" w:eastAsia="Calibri" w:hAnsi="Calibri"/>
-        </w:rPr>
-        <w:t xml:space="preserve">Cài đặt → Chờ duyệt</w:t>
-      </w:r>
-      <w:r>
-        <w:rPr>
-          <w:rFonts w:ascii="Calibri" w:cs="Calibri" w:eastAsia="Calibri" w:hAnsi="Calibri"/>
-        </w:rPr>
-        <w:t xml:space="preserve">.</w:t>
+        <w:t xml:space="preserve">Tự động cho phép thao tác thông thường</w:t>
+      </w:r>
+      <w:r>
+        <w:rPr>
+          <w:rFonts w:ascii="Calibri" w:cs="Calibri" w:eastAsia="Calibri" w:hAnsi="Calibri"/>
+        </w:rPr>
+        <w:t xml:space="preserve">. Bật lên thì AI không hỏi "Cho phép" cho lệnh, sửa tệp, truy cập mạng. Nó vẫn hỏi khi cần bạn nhập thông tin hoặc mở liên kết. Việc ghi MISA </w:t>
+      </w:r>
+      <w:r>
+        <w:rPr>
+          <w:b/>
+          <w:bCs/>
+          <w:rFonts w:ascii="Calibri" w:cs="Calibri" w:eastAsia="Calibri" w:hAnsi="Calibri"/>
+        </w:rPr>
+        <w:t xml:space="preserve">luôn phải qua phiếu duyệt</w:t>
+      </w:r>
+      <w:r>
+        <w:rPr>
+          <w:rFonts w:ascii="Calibri" w:cs="Calibri" w:eastAsia="Calibri" w:hAnsi="Calibri"/>
+        </w:rPr>
+        <w:t xml:space="preserve"> và AI luôn hỏi trước khi gửi email, bất kể công tắc.</w:t>
       </w:r>
     </w:p>
     <w:p>
@@ -1266,7 +1466,7 @@
         <w:rPr>
           <w:rFonts w:ascii="Calibri" w:cs="Calibri" w:eastAsia="Calibri" w:hAnsi="Calibri"/>
         </w:rPr>
-        <w:t xml:space="preserve">8. Quyền của AI</w:t>
+        <w:t xml:space="preserve">10. Dữ liệu nằm ở đâu</w:t>
       </w:r>
     </w:p>
     <w:p>
@@ -1275,45 +1475,36 @@
       </w:pPr>
       <w:r>
         <w:rPr>
-          <w:b/>
-          <w:bCs/>
-          <w:rFonts w:ascii="Calibri" w:cs="Calibri" w:eastAsia="Calibri" w:hAnsi="Calibri"/>
-        </w:rPr>
-        <w:t xml:space="preserve">Cài đặt → Quyền của AI</w:t>
-      </w:r>
-      <w:r>
-        <w:rPr>
-          <w:rFonts w:ascii="Calibri" w:cs="Calibri" w:eastAsia="Calibri" w:hAnsi="Calibri"/>
-        </w:rPr>
-        <w:t xml:space="preserve"> có công tắc </w:t>
-      </w:r>
-      <w:r>
-        <w:rPr>
-          <w:i/>
-          <w:iCs/>
-          <w:rFonts w:ascii="Calibri" w:cs="Calibri" w:eastAsia="Calibri" w:hAnsi="Calibri"/>
-        </w:rPr>
-        <w:t xml:space="preserve">Tự động cho phép thao tác thông thường</w:t>
-      </w:r>
-      <w:r>
-        <w:rPr>
-          <w:rFonts w:ascii="Calibri" w:cs="Calibri" w:eastAsia="Calibri" w:hAnsi="Calibri"/>
-        </w:rPr>
-        <w:t xml:space="preserve">. Bật lên thì AI không hỏi "Cho phép" cho lệnh, sửa tệp, truy cập mạng. Nó vẫn hỏi khi cần bạn nhập thông tin hoặc mở liên kết. Việc ghi MISA </w:t>
-      </w:r>
-      <w:r>
-        <w:rPr>
-          <w:b/>
-          <w:bCs/>
-          <w:rFonts w:ascii="Calibri" w:cs="Calibri" w:eastAsia="Calibri" w:hAnsi="Calibri"/>
-        </w:rPr>
-        <w:t xml:space="preserve">luôn phải qua phiếu duyệt</w:t>
-      </w:r>
-      <w:r>
-        <w:rPr>
-          <w:rFonts w:ascii="Calibri" w:cs="Calibri" w:eastAsia="Calibri" w:hAnsi="Calibri"/>
-        </w:rPr>
-        <w:t xml:space="preserve"> và AI luôn hỏi trước khi gửi email, bất kể công tắc.</w:t>
+          <w:rFonts w:ascii="Calibri" w:cs="Calibri" w:eastAsia="Calibri" w:hAnsi="Calibri"/>
+        </w:rPr>
+        <w:t xml:space="preserve">Mọi dữ liệu ở trên </w:t>
+      </w:r>
+      <w:r>
+        <w:rPr>
+          <w:b/>
+          <w:bCs/>
+          <w:rFonts w:ascii="Calibri" w:cs="Calibri" w:eastAsia="Calibri" w:hAnsi="Calibri"/>
+        </w:rPr>
+        <w:t xml:space="preserve">máy của bạn</w:t>
+      </w:r>
+      <w:r>
+        <w:rPr>
+          <w:rFonts w:ascii="Calibri" w:cs="Calibri" w:eastAsia="Calibri" w:hAnsi="Calibri"/>
+        </w:rPr>
+        <w:t xml:space="preserve">, trong thư mục </w:t>
+      </w:r>
+      <w:r>
+        <w:rPr>
+          <w:rFonts w:ascii="Consolas" w:cs="Consolas" w:eastAsia="Consolas" w:hAnsi="Consolas"/>
+          <w:shd w:fill="F0F0F0" w:val="clear"/>
+        </w:rPr>
+        <w:t xml:space="preserve">C:\Users\&lt;tên&gt;\.accountingx</w:t>
+      </w:r>
+      <w:r>
+        <w:rPr>
+          <w:rFonts w:ascii="Calibri" w:cs="Calibri" w:eastAsia="Calibri" w:hAnsi="Calibri"/>
+        </w:rPr>
+        <w:t xml:space="preserve">. AccountingX không có máy chủ riêng lưu dữ liệu kế toán. Nội dung bạn nhờ AI xử lý đi qua dịch vụ AI của tài khoản ChatGPT bạn đăng nhập.</w:t>
       </w:r>
     </w:p>
     <w:p>
@@ -1325,57 +1516,7 @@
         <w:rPr>
           <w:rFonts w:ascii="Calibri" w:cs="Calibri" w:eastAsia="Calibri" w:hAnsi="Calibri"/>
         </w:rPr>
-        <w:t xml:space="preserve">9. Dữ liệu nằm ở đâu</w:t>
-      </w:r>
-    </w:p>
-    <w:p>
-      <w:pPr>
-        <w:spacing w:after="120"/>
-      </w:pPr>
-      <w:r>
-        <w:rPr>
-          <w:rFonts w:ascii="Calibri" w:cs="Calibri" w:eastAsia="Calibri" w:hAnsi="Calibri"/>
-        </w:rPr>
-        <w:t xml:space="preserve">Mọi dữ liệu ở trên </w:t>
-      </w:r>
-      <w:r>
-        <w:rPr>
-          <w:b/>
-          <w:bCs/>
-          <w:rFonts w:ascii="Calibri" w:cs="Calibri" w:eastAsia="Calibri" w:hAnsi="Calibri"/>
-        </w:rPr>
-        <w:t xml:space="preserve">máy của bạn</w:t>
-      </w:r>
-      <w:r>
-        <w:rPr>
-          <w:rFonts w:ascii="Calibri" w:cs="Calibri" w:eastAsia="Calibri" w:hAnsi="Calibri"/>
-        </w:rPr>
-        <w:t xml:space="preserve">, trong thư mục </w:t>
-      </w:r>
-      <w:r>
-        <w:rPr>
-          <w:rFonts w:ascii="Consolas" w:cs="Consolas" w:eastAsia="Consolas" w:hAnsi="Consolas"/>
-          <w:shd w:fill="F0F0F0" w:val="clear"/>
-        </w:rPr>
-        <w:t xml:space="preserve">C:\Users\&lt;tên&gt;\.accountingx</w:t>
-      </w:r>
-      <w:r>
-        <w:rPr>
-          <w:rFonts w:ascii="Calibri" w:cs="Calibri" w:eastAsia="Calibri" w:hAnsi="Calibri"/>
-        </w:rPr>
-        <w:t xml:space="preserve">. AccountingX không có máy chủ riêng lưu dữ liệu kế toán. Nội dung bạn nhờ AI xử lý đi qua dịch vụ AI của tài khoản ChatGPT bạn đăng nhập.</w:t>
-      </w:r>
-    </w:p>
-    <w:p>
-      <w:pPr>
-        <w:pStyle w:val="Heading2"/>
-        <w:spacing w:before="280" w:after="120"/>
-      </w:pPr>
-      <w:r>
-        <w:rPr>
-          <w:rFonts w:ascii="Calibri" w:cs="Calibri" w:eastAsia="Calibri" w:hAnsi="Calibri"/>
-        </w:rPr>
-        <w:t xml:space="preserve">10. Gặp sự cố?</w:t>
+        <w:t xml:space="preserve">11. Gặp sự cố?</w:t>
       </w:r>
     </w:p>
     <w:p>
@@ -1672,6 +1813,18 @@
     </w:lvl>
   </w:abstractNum>
   <w:abstractNum w:abstractNumId="6" w15:restartNumberingAfterBreak="0">
+    <w:multiLevelType w:val="hybridMultilevel"/>
+    <w:lvl w:ilvl="0" w15:tentative="1">
+      <w:start w:val="1"/>
+      <w:numFmt w:val="decimal"/>
+      <w:lvlText w:val="%1."/>
+      <w:lvlJc w:val="left"/>
+      <w:pPr>
+        <w:ind w:left="720" w:hanging="360"/>
+      </w:pPr>
+    </w:lvl>
+  </w:abstractNum>
+  <w:abstractNum w:abstractNumId="7" w15:restartNumberingAfterBreak="0">
     <w:multiLevelType w:val="hybridMultilevel"/>
     <w:lvl w:ilvl="0" w15:tentative="1">
       <w:start w:val="1"/>
@@ -1715,6 +1868,12 @@
   </w:num>
   <w:num w:numId="6">
     <w:abstractNumId w:val="6"/>
+    <w:lvlOverride w:ilvl="0">
+      <w:startOverride w:val="1"/>
+    </w:lvlOverride>
+  </w:num>
+  <w:num w:numId="7">
+    <w:abstractNumId w:val="7"/>
     <w:lvlOverride w:ilvl="0">
       <w:startOverride w:val="1"/>
     </w:lvlOverride>

</xml_diff>